<commit_message>
Add payment gateway (iPay88, gKash) API integration bullet to Gundam.my experience
</commit_message>
<xml_diff>
--- a/Lai Yoke Yau - Resume.docx
+++ b/Lai Yoke Yau - Resume.docx
@@ -317,7 +317,7 @@
               </w:rPr>
               <w:t xml:space="preserve">LinkedIn: </w:t>
             </w:r>
-            <w:hyperlink w:history="1" r:id="rIdqice7ebpi60ufdow8c14a">
+            <w:hyperlink w:history="1" r:id="rIdrztmkib6lh4sw8is8fhmt">
               <w:r>
                 <w:rPr>
                   <w:rStyle w:val="Hyperlink"/>
@@ -939,6 +939,24 @@
           <w:szCs w:val="19"/>
         </w:rPr>
         <w:t xml:space="preserve">Provided technical support on the Gundam.my e-commerce website, including API integrations across Shopee, Lazada, and TikTok.</w:t>
+      </w:r>
+    </w:p>
+    <w:p>
+      <w:pPr>
+        <w:pStyle w:val="ListParagraph"/>
+        <w:numPr>
+          <w:ilvl w:val="0"/>
+          <w:numId w:val="2"/>
+        </w:numPr>
+        <w:spacing w:after="40" w:line="240"/>
+      </w:pPr>
+      <w:r>
+        <w:rPr>
+          <w:color w:val="222222"/>
+          <w:sz w:val="19"/>
+          <w:szCs w:val="19"/>
+        </w:rPr>
+        <w:t xml:space="preserve">Integrated payment gateway APIs, including iPay88 and gKash, into the Gundam.my e-commerce website.</w:t>
       </w:r>
     </w:p>
     <w:p>

</xml_diff>